<commit_message>
feat(statistiques): volet creneaux (offre) quand le nombre de creneaux differe des seances
Creneaux dates proposes sur la plage, reserves / libres (dont libres deja passes), taux de creneaux reserves, anneau et tableau par mois (proposes, reserves, libres, seances). Affiche seulement si creneaux != seances ; toujours present dans l export CSV. Calcul pur teste dans lib/slot-stats. Guide + onboarding + aide integree + Word regeneres.

Co-Authored-By: Claude Fable 5.1 <noreply@anthropic.com>
</commit_message>
<xml_diff>
--- a/docs/Guide-utilisation.docx
+++ b/docs/Guide-utilisation.docx
@@ -2560,6 +2560,64 @@
       </w:r>
       <w:r>
         <w:t xml:space="preserve">.</w:t>
+      </w:r>
+    </w:p>
+    <w:p>
+      <w:pPr>
+        <w:spacing w:after="160"/>
+      </w:pPr>
+      <w:r>
+        <w:t xml:space="preserve">Les statistiques comptent des </w:t>
+      </w:r>
+      <w:r>
+        <w:rPr>
+          <w:b/>
+          <w:bCs/>
+        </w:rPr>
+        <w:t xml:space="preserve">séances</w:t>
+      </w:r>
+      <w:r>
+        <w:t xml:space="preserve"> (une réservation à une date donnée, chaque occurrence d'une réservation récurrente comptant une fois). Dès que le nombre de </w:t>
+      </w:r>
+      <w:r>
+        <w:rPr>
+          <w:b/>
+          <w:bCs/>
+        </w:rPr>
+        <w:t xml:space="preserve">créneaux</w:t>
+      </w:r>
+      <w:r>
+        <w:t xml:space="preserve"> proposés diffère du nombre de séances — créneaux restés libres, ou créneaux à jauge accueillant plusieurs réservations — un volet </w:t>
+      </w:r>
+      <w:r>
+        <w:rPr>
+          <w:b/>
+          <w:bCs/>
+        </w:rPr>
+        <w:t xml:space="preserve">créneaux</w:t>
+      </w:r>
+      <w:r>
+        <w:t xml:space="preserve"> s'ajoute : compteurs « Créneaux proposés » (avec les libres, dont ceux déjà passés) et « Créneaux réservés » (part des créneaux portant au moins une séance), un anneau </w:t>
+      </w:r>
+      <w:r>
+        <w:rPr>
+          <w:b/>
+          <w:bCs/>
+        </w:rPr>
+        <w:t xml:space="preserve">« Créneaux — réservés / libres »</w:t>
+      </w:r>
+      <w:r>
+        <w:t xml:space="preserve"> et un tableau </w:t>
+      </w:r>
+      <w:r>
+        <w:rPr>
+          <w:b/>
+          <w:bCs/>
+        </w:rPr>
+        <w:t xml:space="preserve">« Créneaux par mois »</w:t>
+      </w:r>
+      <w:r>
+        <w:t xml:space="preserve"> (proposés, réservés, libres, séances). Le taux de créneaux réservés mesure l'usage de l'offre ; il ne se confond pas avec le remplissage, qui mesure la jauge des seuls créneaux réservés. L'export CSV contient toujours ce volet.</w:t>
       </w:r>
     </w:p>
     <w:p>

</xml_diff>

<commit_message>
feat(agenda): fiche de reservation, liste des creneaux concernes aussi sur une occurrence recurrente
La fiche ouverte sur une seance d une recurrente liste toute la fratrie (dates + horaires) comme la fiche parente et la modale creneaux, la seance ouverte en gras. Guide + aide integree + Word regeneres.

Co-Authored-By: Claude Fable 5.1 <noreply@anthropic.com>
</commit_message>
<xml_diff>
--- a/docs/Guide-utilisation.docx
+++ b/docs/Guide-utilisation.docx
@@ -2183,7 +2183,27 @@
         <w:t xml:space="preserve">semaine datée</w:t>
       </w:r>
       <w:r>
-        <w:t xml:space="preserve"> : créneaux récurrents et ponctuels, réservations et pointages s'y gèrent au même endroit, semaine après semaine (flèches ◀ ▶ et onglets de période).</w:t>
+        <w:t xml:space="preserve"> : créneaux récurrents et ponctuels, réservations et pointages s'y gèrent au même endroit, semaine après semaine (flèches ◀ ▶ et onglets de période). Un clic sur une réservation ouvre sa </w:t>
+      </w:r>
+      <w:r>
+        <w:rPr>
+          <w:b/>
+          <w:bCs/>
+        </w:rPr>
+        <w:t xml:space="preserve">fiche</w:t>
+      </w:r>
+      <w:r>
+        <w:t xml:space="preserve"> : demandeur, participants, thème, absence prévenue et, pour une réservation récurrente, la liste des </w:t>
+      </w:r>
+      <w:r>
+        <w:rPr>
+          <w:b/>
+          <w:bCs/>
+        </w:rPr>
+        <w:t xml:space="preserve">« Créneaux concernés »</w:t>
+      </w:r>
+      <w:r>
+        <w:t xml:space="preserve"> (toutes ses séances avec leurs horaires, la séance ouverte en gras).</w:t>
       </w:r>
     </w:p>
     <w:p>

</xml_diff>

<commit_message>
fix(statistiques): un creneau recurrent compte pour un seul creneau dans le volet creneaux
Precision Dom 2026-09-12 : l offre se compte comme la carte Creneaux ouverts des Editions (recurrent = 1, ponctuel = 1), un recurrent est reserve des qu une de ses occurrences l est, libre passe = derniere occurrence echue ; par mois, un recurrent compte une fois par mois ou il a une occurrence. Tests, aides a l ecran, guide, aide integree et Word mis a jour.

Co-Authored-By: Claude Fable 5.1 <noreply@anthropic.com>
</commit_message>
<xml_diff>
--- a/docs/Guide-utilisation.docx
+++ b/docs/Guide-utilisation.docx
@@ -2607,7 +2607,7 @@
         <w:t xml:space="preserve">créneaux</w:t>
       </w:r>
       <w:r>
-        <w:t xml:space="preserve"> proposés diffère du nombre de séances — créneaux restés libres, ou créneaux à jauge accueillant plusieurs réservations — un volet </w:t>
+        <w:t xml:space="preserve"> proposés diffère du nombre de séances, un volet </w:t>
       </w:r>
       <w:r>
         <w:rPr>
@@ -2617,7 +2617,17 @@
         <w:t xml:space="preserve">créneaux</w:t>
       </w:r>
       <w:r>
-        <w:t xml:space="preserve"> s'ajoute : compteurs « Créneaux proposés » (avec les libres, dont ceux déjà passés) et « Créneaux réservés » (part des créneaux portant au moins une séance), un anneau </w:t>
+        <w:t xml:space="preserve"> s'ajoute. Un créneau </w:t>
+      </w:r>
+      <w:r>
+        <w:rPr>
+          <w:b/>
+          <w:bCs/>
+        </w:rPr>
+        <w:t xml:space="preserve">récurrent compte pour un seul créneau</w:t>
+      </w:r>
+      <w:r>
+        <w:t xml:space="preserve">, comme dans la liste des créneaux ouverts des Éditions, et un ponctuel pour un ; un récurrent est « réservé » dès qu'une de ses occurrences l'est. Le volet comprend les compteurs « Créneaux proposés » (avec les libres, dont ceux entièrement passés) et « Créneaux réservés » (part des créneaux portant au moins une séance), un anneau </w:t>
       </w:r>
       <w:r>
         <w:rPr>
@@ -2637,7 +2647,7 @@
         <w:t xml:space="preserve">« Créneaux par mois »</w:t>
       </w:r>
       <w:r>
-        <w:t xml:space="preserve"> (proposés, réservés, libres, séances). Le taux de créneaux réservés mesure l'usage de l'offre ; il ne se confond pas avec le remplissage, qui mesure la jauge des seuls créneaux réservés. L'export CSV contient toujours ce volet.</w:t>
+        <w:t xml:space="preserve"> (créneaux ayant une occurrence dans le mois, réservés dans le mois, libres, séances). Le taux de créneaux réservés mesure l'usage de l'offre ; il ne se confond pas avec le remplissage, qui mesure la jauge des seuls créneaux réservés. L'export CSV contient toujours ce volet.</w:t>
       </w:r>
     </w:p>
     <w:p>

</xml_diff>

<commit_message>
feat(statistiques): remplissage moyen sur toute l offre, seances vides a 0 pour cent
Decision Dom 2026-09-13 : le compteur et la courbe par mois portent sur toutes les seances proposees de la plage (une seance sans reservation compte 0 pour cent) ; l ancienne lecture (seances reservees seules) reste en sous-texte du compteur et dans l export CSV. Remplissage par structure inchange. Guide, aide integree et Word mis a jour.

Co-Authored-By: Claude Fable 5.1 <noreply@anthropic.com>
</commit_message>
<xml_diff>
--- a/docs/Guide-utilisation.docx
+++ b/docs/Guide-utilisation.docx
@@ -2647,7 +2647,45 @@
         <w:t xml:space="preserve">« Créneaux par mois »</w:t>
       </w:r>
       <w:r>
-        <w:t xml:space="preserve"> (créneaux ayant une occurrence dans le mois, réservés dans le mois, libres, séances). Le taux de créneaux réservés mesure l'usage de l'offre ; il ne se confond pas avec le remplissage, qui mesure la jauge des seuls créneaux réservés. L'export CSV contient toujours ce volet.</w:t>
+        <w:t xml:space="preserve"> (créneaux ayant une occurrence dans le mois, réservés dans le mois, libres, séances). L'export CSV contient toujours ce volet.</w:t>
+      </w:r>
+    </w:p>
+    <w:p>
+      <w:pPr>
+        <w:spacing w:after="160"/>
+      </w:pPr>
+      <w:r>
+        <w:t xml:space="preserve">Le </w:t>
+      </w:r>
+      <w:r>
+        <w:rPr>
+          <w:b/>
+          <w:bCs/>
+        </w:rPr>
+        <w:t xml:space="preserve">remplissage moyen</w:t>
+      </w:r>
+      <w:r>
+        <w:t xml:space="preserve"> (compteur et courbe par mois) porte sur </w:t>
+      </w:r>
+      <w:r>
+        <w:rPr>
+          <w:b/>
+          <w:bCs/>
+        </w:rPr>
+        <w:t xml:space="preserve">toutes les séances proposées</w:t>
+      </w:r>
+      <w:r>
+        <w:t xml:space="preserve"> de la plage : une séance restée sans réservation compte 0 %. Le compteur rappelle en dessous le remplissage des seules séances réservées quand il diffère. L'occupation d'une séance se mesure en enfants (et accompagnants, selon le réglage du service) sur la capacité du créneau s'il a une jauge, sinon en nombre de réservations sur la capacité. Le remplissage </w:t>
+      </w:r>
+      <w:r>
+        <w:rPr>
+          <w:b/>
+          <w:bCs/>
+        </w:rPr>
+        <w:t xml:space="preserve">par structure</w:t>
+      </w:r>
+      <w:r>
+        <w:t xml:space="preserve"> reste calculé sur les séances réservées, une séance vide n'appartenant à aucune structure.</w:t>
       </w:r>
     </w:p>
     <w:p>

</xml_diff>

<commit_message>
feat(utilisateurs): bouton Actualiser sur l onglet Connectes
Relit le releve a la demande (en plus du rafraichissement automatique toutes les
30 s), etat Actualisation... pendant le rechargement. Guide + aide integree +
guides Word mis a jour.

Co-Authored-By: Claude Fable 5.1 <noreply@anthropic.com>
</commit_message>
<xml_diff>
--- a/docs/Guide-utilisation.docx
+++ b/docs/Guide-utilisation.docx
@@ -4256,7 +4256,17 @@
         <w:t xml:space="preserve">« Connectés »</w:t>
       </w:r>
       <w:r>
-        <w:t xml:space="preserve"> liste les comptes dont une session est encore valide au sens de la déconnexion automatique (2 h sans action pour un usager, 15 min pour un gestionnaire ou un administrateur, plafond de 24 h ou 8 h), avec leur dernière action, la date de connexion, les appareils et le nombre de sessions ; le tableau se rafraîchit toutes les 30 secondes. </w:t>
+        <w:t xml:space="preserve"> liste les comptes dont une session est encore valide au sens de la déconnexion automatique (2 h sans action pour un usager, 15 min pour un gestionnaire ou un administrateur, plafond de 24 h ou 8 h), avec leur dernière action, la date de connexion, les appareils et le nombre de sessions ; le tableau se rafraîchit toutes les 30 secondes, et à la demande avec le bouton </w:t>
+      </w:r>
+      <w:r>
+        <w:rPr>
+          <w:b/>
+          <w:bCs/>
+        </w:rPr>
+        <w:t xml:space="preserve">« Actualiser »</w:t>
+      </w:r>
+      <w:r>
+        <w:t xml:space="preserve">. </w:t>
       </w:r>
       <w:r>
         <w:rPr>

</xml_diff>

<commit_message>
feat(statistiques): mois en lettres abregees sur toutes les series par mois ; suppression du remplissage moyen par structure
monthShortLabel (lib/format) partage par Creneaux par mois, Evolution mensuelle,
Remplissage moyen par mois et inscriptions en liste d attente par mois ; export CSV
aligne ; tests mis a jour. Panneau Remplissage moyen par structure (jauge) retire de
la page, de l export et du calcul ; guide + aide integree + guides Word mis a jour.

Capture docs/img/08-statistiques.png a refaire (signale).

Co-Authored-By: Claude Fable 5.1 <noreply@anthropic.com>
</commit_message>
<xml_diff>
--- a/docs/Guide-utilisation.docx
+++ b/docs/Guide-utilisation.docx
@@ -2675,17 +2675,7 @@
         <w:t xml:space="preserve">toutes les séances proposées</w:t>
       </w:r>
       <w:r>
-        <w:t xml:space="preserve"> de la plage : une séance restée sans réservation compte 0 %. Le compteur rappelle en dessous le remplissage des seules séances réservées quand il diffère. L'occupation d'une séance se mesure en enfants (et accompagnants, selon le réglage du service) sur la capacité du créneau s'il a une jauge, sinon en nombre de réservations sur la capacité. Le remplissage </w:t>
-      </w:r>
-      <w:r>
-        <w:rPr>
-          <w:b/>
-          <w:bCs/>
-        </w:rPr>
-        <w:t xml:space="preserve">par structure</w:t>
-      </w:r>
-      <w:r>
-        <w:t xml:space="preserve"> reste calculé sur les séances réservées, une séance vide n'appartenant à aucune structure.</w:t>
+        <w:t xml:space="preserve"> de la plage : une séance restée sans réservation compte 0 %. Le compteur rappelle en dessous le remplissage des seules séances réservées quand il diffère. L'occupation d'une séance se mesure en enfants (et accompagnants, selon le réglage du service) sur la capacité du créneau s'il a une jauge, sinon en nombre de réservations sur la capacité.</w:t>
       </w:r>
     </w:p>
     <w:p>

</xml_diff>